<commit_message>
Typeset docx equations as native Word math
Replace the ASCII equation text in the Word export with OMML equations,
numbered flush right, and typeset the inline symbols in the body text.
</commit_message>
<xml_diff>
--- a/paper/manuscript.docx
+++ b/paper/manuscript.docx
@@ -354,36 +354,533 @@
         <w:jc w:val="both"/>
       </w:pPr>
       <w:r>
-        <w:t>Let s_i(t) denote the sound measurement and a_i(t) the acceleration summary for badge i. The labeler first compares a short rolling mean of sound with a longer rolling quantile baseline:</w:t>
+        <w:t xml:space="preserve">Let </w:t>
+      </w:r>
+      <m:oMath>
+        <m:sSub>
+          <m:e>
+            <m:r>
+              <w:rPr>
+                <w:rFonts w:ascii="Cambria Math" w:hAnsi="Cambria Math"/>
+                <w:sz w:val="20"/>
+              </w:rPr>
+              <m:t xml:space="preserve">s</m:t>
+            </m:r>
+          </m:e>
+          <m:sub>
+            <m:r>
+              <w:rPr>
+                <w:rFonts w:ascii="Cambria Math" w:hAnsi="Cambria Math"/>
+                <w:sz w:val="20"/>
+              </w:rPr>
+              <m:t xml:space="preserve">i</m:t>
+            </m:r>
+          </m:sub>
+        </m:sSub>
+        <m:r>
+          <w:rPr>
+            <w:rFonts w:ascii="Cambria Math" w:hAnsi="Cambria Math"/>
+            <w:sz w:val="20"/>
+          </w:rPr>
+          <m:t xml:space="preserve">(</m:t>
+        </m:r>
+        <m:r>
+          <w:rPr>
+            <w:rFonts w:ascii="Cambria Math" w:hAnsi="Cambria Math"/>
+            <w:sz w:val="20"/>
+          </w:rPr>
+          <m:t xml:space="preserve">t</m:t>
+        </m:r>
+        <m:r>
+          <w:rPr>
+            <w:rFonts w:ascii="Cambria Math" w:hAnsi="Cambria Math"/>
+            <w:sz w:val="20"/>
+          </w:rPr>
+          <m:t xml:space="preserve">)</m:t>
+        </m:r>
+      </m:oMath>
+      <w:r>
+        <w:t xml:space="preserve"> denote the sound measurement and </w:t>
+      </w:r>
+      <m:oMath>
+        <m:sSub>
+          <m:e>
+            <m:r>
+              <w:rPr>
+                <w:rFonts w:ascii="Cambria Math" w:hAnsi="Cambria Math"/>
+                <w:sz w:val="20"/>
+              </w:rPr>
+              <m:t xml:space="preserve">a</m:t>
+            </m:r>
+          </m:e>
+          <m:sub>
+            <m:r>
+              <w:rPr>
+                <w:rFonts w:ascii="Cambria Math" w:hAnsi="Cambria Math"/>
+                <w:sz w:val="20"/>
+              </w:rPr>
+              <m:t xml:space="preserve">i</m:t>
+            </m:r>
+          </m:sub>
+        </m:sSub>
+        <m:r>
+          <w:rPr>
+            <w:rFonts w:ascii="Cambria Math" w:hAnsi="Cambria Math"/>
+            <w:sz w:val="20"/>
+          </w:rPr>
+          <m:t xml:space="preserve">(</m:t>
+        </m:r>
+        <m:r>
+          <w:rPr>
+            <w:rFonts w:ascii="Cambria Math" w:hAnsi="Cambria Math"/>
+            <w:sz w:val="20"/>
+          </w:rPr>
+          <m:t xml:space="preserve">t</m:t>
+        </m:r>
+        <m:r>
+          <w:rPr>
+            <w:rFonts w:ascii="Cambria Math" w:hAnsi="Cambria Math"/>
+            <w:sz w:val="20"/>
+          </w:rPr>
+          <m:t xml:space="preserve">)</m:t>
+        </m:r>
+      </m:oMath>
+      <w:r>
+        <w:t xml:space="preserve"> the acceleration summary for badge </w:t>
+      </w:r>
+      <m:oMath>
+        <m:r>
+          <w:rPr>
+            <w:rFonts w:ascii="Cambria Math" w:hAnsi="Cambria Math"/>
+            <w:sz w:val="20"/>
+          </w:rPr>
+          <m:t xml:space="preserve">i</m:t>
+        </m:r>
+      </m:oMath>
+      <w:r>
+        <w:t>. The labeler first compares a short rolling mean of sound with a longer rolling quantile baseline:</w:t>
       </w:r>
     </w:p>
-    <w:p>
-      <w:pPr>
-        <w:keepNext w:val="0"/>
-        <w:tabs>
-          <w:tab w:pos="2502" w:val="center"/>
-          <w:tab w:pos="5004" w:val="right"/>
-        </w:tabs>
-        <w:spacing w:before="100" w:after="100"/>
-        <w:ind w:firstLine="0"/>
-      </w:pPr>
-      <w:r>
-        <w:rPr>
-          <w:sz w:val="18"/>
-        </w:rPr>
-        <w:tab/>
-        <w:t>v_i(t) = 1{m_i(t) &gt; q_0.45^s(t)}.</w:t>
-        <w:tab/>
-        <w:t>(1)</w:t>
-      </w:r>
-    </w:p>
+    <w:tbl>
+      <w:tblPr>
+        <w:tblW w:type="auto" w:w="0"/>
+        <w:jc w:val="center"/>
+        <w:tblLayout w:type="fixed"/>
+        <w:tblLook w:firstColumn="1" w:firstRow="1" w:lastColumn="0" w:lastRow="0" w:noHBand="0" w:noVBand="1" w:val="04A0"/>
+        <w:tblLayout w:type="fixed"/>
+        <w:tblCellMar>
+          <w:left w:w="0" w:type="dxa"/>
+          <w:right w:w="0" w:type="dxa"/>
+        </w:tblCellMar>
+      </w:tblPr>
+      <w:tblGrid>
+        <w:gridCol w:w="504"/>
+        <w:gridCol w:w="3996"/>
+        <w:gridCol w:w="504"/>
+      </w:tblGrid>
+      <w:tr>
+        <w:tc>
+          <w:tcPr>
+            <w:tcW w:type="dxa" w:w="504"/>
+            <w:vAlign w:val="center"/>
+          </w:tcPr>
+          <w:p>
+            <w:pPr>
+              <w:spacing w:before="100" w:after="100"/>
+              <w:ind w:firstLine="0"/>
+              <w:jc w:val="left"/>
+            </w:pPr>
+          </w:p>
+        </w:tc>
+        <w:tc>
+          <w:tcPr>
+            <w:tcW w:type="dxa" w:w="3996"/>
+            <w:vAlign w:val="center"/>
+          </w:tcPr>
+          <w:p>
+            <w:pPr>
+              <w:spacing w:before="100" w:after="100"/>
+              <w:ind w:firstLine="0"/>
+              <w:jc w:val="center"/>
+            </w:pPr>
+            <m:oMathPara>
+              <m:oMathParaPr>
+                <m:jc m:val="center"/>
+              </m:oMathParaPr>
+              <m:oMath>
+                <m:sSub>
+                  <m:e>
+                    <m:r>
+                      <w:rPr>
+                        <w:rFonts w:ascii="Cambria Math" w:hAnsi="Cambria Math"/>
+                        <w:sz w:val="20"/>
+                      </w:rPr>
+                      <m:t xml:space="preserve">v</m:t>
+                    </m:r>
+                  </m:e>
+                  <m:sub>
+                    <m:r>
+                      <w:rPr>
+                        <w:rFonts w:ascii="Cambria Math" w:hAnsi="Cambria Math"/>
+                        <w:sz w:val="20"/>
+                      </w:rPr>
+                      <m:t xml:space="preserve">i</m:t>
+                    </m:r>
+                  </m:sub>
+                </m:sSub>
+                <m:r>
+                  <w:rPr>
+                    <w:rFonts w:ascii="Cambria Math" w:hAnsi="Cambria Math"/>
+                    <w:sz w:val="20"/>
+                  </w:rPr>
+                  <m:t xml:space="preserve">(</m:t>
+                </m:r>
+                <m:r>
+                  <w:rPr>
+                    <w:rFonts w:ascii="Cambria Math" w:hAnsi="Cambria Math"/>
+                    <w:sz w:val="20"/>
+                  </w:rPr>
+                  <m:t xml:space="preserve">t</m:t>
+                </m:r>
+                <m:r>
+                  <w:rPr>
+                    <w:rFonts w:ascii="Cambria Math" w:hAnsi="Cambria Math"/>
+                    <w:sz w:val="20"/>
+                  </w:rPr>
+                  <m:t xml:space="preserve">)</m:t>
+                </m:r>
+                <m:r>
+                  <w:rPr>
+                    <w:rFonts w:ascii="Cambria Math" w:hAnsi="Cambria Math"/>
+                    <w:sz w:val="20"/>
+                  </w:rPr>
+                  <m:t xml:space="preserve">=</m:t>
+                </m:r>
+                <m:r>
+                  <m:rPr>
+                    <m:nor/>
+                  </m:rPr>
+                  <w:rPr>
+                    <w:rFonts w:ascii="Cambria Math" w:hAnsi="Cambria Math"/>
+                    <w:b/>
+                    <w:sz w:val="20"/>
+                  </w:rPr>
+                  <m:t xml:space="preserve">1</m:t>
+                </m:r>
+                <m:d>
+                  <m:dPr>
+                    <m:begChr m:val="{"/>
+                    <m:endChr m:val="}"/>
+                  </m:dPr>
+                  <m:e>
+                    <m:sSub>
+                      <m:e>
+                        <m:r>
+                          <w:rPr>
+                            <w:rFonts w:ascii="Cambria Math" w:hAnsi="Cambria Math"/>
+                            <w:sz w:val="20"/>
+                          </w:rPr>
+                          <m:t xml:space="preserve">m</m:t>
+                        </m:r>
+                      </m:e>
+                      <m:sub>
+                        <m:r>
+                          <w:rPr>
+                            <w:rFonts w:ascii="Cambria Math" w:hAnsi="Cambria Math"/>
+                            <w:sz w:val="20"/>
+                          </w:rPr>
+                          <m:t xml:space="preserve">i</m:t>
+                        </m:r>
+                      </m:sub>
+                    </m:sSub>
+                    <m:r>
+                      <w:rPr>
+                        <w:rFonts w:ascii="Cambria Math" w:hAnsi="Cambria Math"/>
+                        <w:sz w:val="20"/>
+                      </w:rPr>
+                      <m:t xml:space="preserve">(</m:t>
+                    </m:r>
+                    <m:r>
+                      <w:rPr>
+                        <w:rFonts w:ascii="Cambria Math" w:hAnsi="Cambria Math"/>
+                        <w:sz w:val="20"/>
+                      </w:rPr>
+                      <m:t xml:space="preserve">t</m:t>
+                    </m:r>
+                    <m:r>
+                      <w:rPr>
+                        <w:rFonts w:ascii="Cambria Math" w:hAnsi="Cambria Math"/>
+                        <w:sz w:val="20"/>
+                      </w:rPr>
+                      <m:t xml:space="preserve">)</m:t>
+                    </m:r>
+                    <m:r>
+                      <w:rPr>
+                        <w:rFonts w:ascii="Cambria Math" w:hAnsi="Cambria Math"/>
+                        <w:sz w:val="20"/>
+                      </w:rPr>
+                      <m:t xml:space="preserve">&gt;</m:t>
+                    </m:r>
+                    <m:sSubSup>
+                      <m:e>
+                        <m:r>
+                          <w:rPr>
+                            <w:rFonts w:ascii="Cambria Math" w:hAnsi="Cambria Math"/>
+                            <w:sz w:val="20"/>
+                          </w:rPr>
+                          <m:t xml:space="preserve">q</m:t>
+                        </m:r>
+                      </m:e>
+                      <m:sub>
+                        <m:r>
+                          <w:rPr>
+                            <w:rFonts w:ascii="Cambria Math" w:hAnsi="Cambria Math"/>
+                            <w:sz w:val="20"/>
+                          </w:rPr>
+                          <m:t xml:space="preserve">0.45</m:t>
+                        </m:r>
+                      </m:sub>
+                      <m:sup>
+                        <m:r>
+                          <w:rPr>
+                            <w:rFonts w:ascii="Cambria Math" w:hAnsi="Cambria Math"/>
+                            <w:sz w:val="20"/>
+                          </w:rPr>
+                          <m:t xml:space="preserve">s</m:t>
+                        </m:r>
+                      </m:sup>
+                    </m:sSubSup>
+                    <m:r>
+                      <w:rPr>
+                        <w:rFonts w:ascii="Cambria Math" w:hAnsi="Cambria Math"/>
+                        <w:sz w:val="20"/>
+                      </w:rPr>
+                      <m:t xml:space="preserve">(</m:t>
+                    </m:r>
+                    <m:r>
+                      <w:rPr>
+                        <w:rFonts w:ascii="Cambria Math" w:hAnsi="Cambria Math"/>
+                        <w:sz w:val="20"/>
+                      </w:rPr>
+                      <m:t xml:space="preserve">t</m:t>
+                    </m:r>
+                    <m:r>
+                      <w:rPr>
+                        <w:rFonts w:ascii="Cambria Math" w:hAnsi="Cambria Math"/>
+                        <w:sz w:val="20"/>
+                      </w:rPr>
+                      <m:t xml:space="preserve">)</m:t>
+                    </m:r>
+                  </m:e>
+                </m:d>
+                <m:r>
+                  <w:rPr>
+                    <w:rFonts w:ascii="Cambria Math" w:hAnsi="Cambria Math"/>
+                    <w:sz w:val="20"/>
+                  </w:rPr>
+                  <m:t xml:space="preserve">.</m:t>
+                </m:r>
+              </m:oMath>
+            </m:oMathPara>
+          </w:p>
+        </w:tc>
+        <w:tc>
+          <w:tcPr>
+            <w:tcW w:type="dxa" w:w="504"/>
+            <w:vAlign w:val="center"/>
+          </w:tcPr>
+          <w:p>
+            <w:pPr>
+              <w:spacing w:before="100" w:after="100"/>
+              <w:ind w:firstLine="0"/>
+              <w:jc w:val="right"/>
+            </w:pPr>
+            <w:r>
+              <w:t>(1)</w:t>
+            </w:r>
+          </w:p>
+        </w:tc>
+      </w:tr>
+    </w:tbl>
     <w:p>
       <w:pPr>
         <w:spacing w:before="0" w:after="0"/>
         <w:jc w:val="both"/>
       </w:pPr>
       <w:r>
-        <w:t>Here, m_i(t) is the 1 s sound mean, and q_p^x(t) is the rolling p-quantile of signal x_i over 60 s. The indicator 1{condition} equals 1 when the condition holds and 0 otherwise.</w:t>
+        <w:t xml:space="preserve">Here, </w:t>
+      </w:r>
+      <m:oMath>
+        <m:sSub>
+          <m:e>
+            <m:r>
+              <w:rPr>
+                <w:rFonts w:ascii="Cambria Math" w:hAnsi="Cambria Math"/>
+                <w:sz w:val="20"/>
+              </w:rPr>
+              <m:t xml:space="preserve">m</m:t>
+            </m:r>
+          </m:e>
+          <m:sub>
+            <m:r>
+              <w:rPr>
+                <w:rFonts w:ascii="Cambria Math" w:hAnsi="Cambria Math"/>
+                <w:sz w:val="20"/>
+              </w:rPr>
+              <m:t xml:space="preserve">i</m:t>
+            </m:r>
+          </m:sub>
+        </m:sSub>
+        <m:r>
+          <w:rPr>
+            <w:rFonts w:ascii="Cambria Math" w:hAnsi="Cambria Math"/>
+            <w:sz w:val="20"/>
+          </w:rPr>
+          <m:t xml:space="preserve">(</m:t>
+        </m:r>
+        <m:r>
+          <w:rPr>
+            <w:rFonts w:ascii="Cambria Math" w:hAnsi="Cambria Math"/>
+            <w:sz w:val="20"/>
+          </w:rPr>
+          <m:t xml:space="preserve">t</m:t>
+        </m:r>
+        <m:r>
+          <w:rPr>
+            <w:rFonts w:ascii="Cambria Math" w:hAnsi="Cambria Math"/>
+            <w:sz w:val="20"/>
+          </w:rPr>
+          <m:t xml:space="preserve">)</m:t>
+        </m:r>
+      </m:oMath>
+      <w:r>
+        <w:t xml:space="preserve"> is the 1 s sound mean, and </w:t>
+      </w:r>
+      <m:oMath>
+        <m:sSubSup>
+          <m:e>
+            <m:r>
+              <w:rPr>
+                <w:rFonts w:ascii="Cambria Math" w:hAnsi="Cambria Math"/>
+                <w:sz w:val="20"/>
+              </w:rPr>
+              <m:t xml:space="preserve">q</m:t>
+            </m:r>
+          </m:e>
+          <m:sub>
+            <m:r>
+              <w:rPr>
+                <w:rFonts w:ascii="Cambria Math" w:hAnsi="Cambria Math"/>
+                <w:sz w:val="20"/>
+              </w:rPr>
+              <m:t xml:space="preserve">p</m:t>
+            </m:r>
+          </m:sub>
+          <m:sup>
+            <m:r>
+              <w:rPr>
+                <w:rFonts w:ascii="Cambria Math" w:hAnsi="Cambria Math"/>
+                <w:sz w:val="20"/>
+              </w:rPr>
+              <m:t xml:space="preserve">x</m:t>
+            </m:r>
+          </m:sup>
+        </m:sSubSup>
+        <m:r>
+          <w:rPr>
+            <w:rFonts w:ascii="Cambria Math" w:hAnsi="Cambria Math"/>
+            <w:sz w:val="20"/>
+          </w:rPr>
+          <m:t xml:space="preserve">(</m:t>
+        </m:r>
+        <m:r>
+          <w:rPr>
+            <w:rFonts w:ascii="Cambria Math" w:hAnsi="Cambria Math"/>
+            <w:sz w:val="20"/>
+          </w:rPr>
+          <m:t xml:space="preserve">t</m:t>
+        </m:r>
+        <m:r>
+          <w:rPr>
+            <w:rFonts w:ascii="Cambria Math" w:hAnsi="Cambria Math"/>
+            <w:sz w:val="20"/>
+          </w:rPr>
+          <m:t xml:space="preserve">)</m:t>
+        </m:r>
+      </m:oMath>
+      <w:r>
+        <w:t xml:space="preserve"> is the rolling </w:t>
+      </w:r>
+      <m:oMath>
+        <m:r>
+          <w:rPr>
+            <w:rFonts w:ascii="Cambria Math" w:hAnsi="Cambria Math"/>
+            <w:sz w:val="20"/>
+          </w:rPr>
+          <m:t xml:space="preserve">p</m:t>
+        </m:r>
+      </m:oMath>
+      <w:r>
+        <w:t xml:space="preserve">-quantile of signal </w:t>
+      </w:r>
+      <m:oMath>
+        <m:sSub>
+          <m:e>
+            <m:r>
+              <w:rPr>
+                <w:rFonts w:ascii="Cambria Math" w:hAnsi="Cambria Math"/>
+                <w:sz w:val="20"/>
+              </w:rPr>
+              <m:t xml:space="preserve">x</m:t>
+            </m:r>
+          </m:e>
+          <m:sub>
+            <m:r>
+              <w:rPr>
+                <w:rFonts w:ascii="Cambria Math" w:hAnsi="Cambria Math"/>
+                <w:sz w:val="20"/>
+              </w:rPr>
+              <m:t xml:space="preserve">i</m:t>
+            </m:r>
+          </m:sub>
+        </m:sSub>
+      </m:oMath>
+      <w:r>
+        <w:t xml:space="preserve"> over 60 s. The indicator </w:t>
+      </w:r>
+      <m:oMath>
+        <m:r>
+          <m:rPr>
+            <m:nor/>
+          </m:rPr>
+          <w:rPr>
+            <w:rFonts w:ascii="Cambria Math" w:hAnsi="Cambria Math"/>
+            <w:b/>
+            <w:sz w:val="20"/>
+          </w:rPr>
+          <m:t xml:space="preserve">1</m:t>
+        </m:r>
+        <m:d>
+          <m:dPr>
+            <m:begChr m:val="{"/>
+            <m:endChr m:val="}"/>
+          </m:dPr>
+          <m:e>
+            <m:r>
+              <m:rPr>
+                <m:nor/>
+              </m:rPr>
+              <w:rPr>
+                <w:rFonts w:ascii="Cambria Math" w:hAnsi="Cambria Math"/>
+                <w:sz w:val="20"/>
+              </w:rPr>
+              <m:t xml:space="preserve">condition</m:t>
+            </m:r>
+          </m:e>
+        </m:d>
+      </m:oMath>
+      <w:r>
+        <w:t xml:space="preserve"> equals 1 when the condition holds and 0 otherwise.</w:t>
       </w:r>
     </w:p>
     <w:p>
@@ -395,33 +892,414 @@
         <w:t>The short window is 1 s and the baseline window is 60 s. The baseline requires at least ten observations. Sound and acceleration are separately normalized relative to each badge's rolling lower quartile and interquartile range (IQR):</w:t>
       </w:r>
     </w:p>
-    <w:p>
-      <w:pPr>
-        <w:keepNext w:val="0"/>
-        <w:tabs>
-          <w:tab w:pos="2502" w:val="center"/>
-          <w:tab w:pos="5004" w:val="right"/>
-        </w:tabs>
-        <w:spacing w:before="100" w:after="100"/>
-        <w:ind w:firstLine="0"/>
-      </w:pPr>
-      <w:r>
-        <w:rPr>
-          <w:sz w:val="18"/>
-        </w:rPr>
-        <w:tab/>
-        <w:t>z_i^x = (x_i - q_0.25^x) / max(IQR_i^x, 1).</w:t>
-        <w:tab/>
-        <w:t>(2)</w:t>
-      </w:r>
-    </w:p>
+    <w:tbl>
+      <w:tblPr>
+        <w:tblW w:type="auto" w:w="0"/>
+        <w:jc w:val="center"/>
+        <w:tblLayout w:type="fixed"/>
+        <w:tblLook w:firstColumn="1" w:firstRow="1" w:lastColumn="0" w:lastRow="0" w:noHBand="0" w:noVBand="1" w:val="04A0"/>
+        <w:tblLayout w:type="fixed"/>
+        <w:tblCellMar>
+          <w:left w:w="0" w:type="dxa"/>
+          <w:right w:w="0" w:type="dxa"/>
+        </w:tblCellMar>
+      </w:tblPr>
+      <w:tblGrid>
+        <w:gridCol w:w="504"/>
+        <w:gridCol w:w="3996"/>
+        <w:gridCol w:w="504"/>
+      </w:tblGrid>
+      <w:tr>
+        <w:tc>
+          <w:tcPr>
+            <w:tcW w:type="dxa" w:w="504"/>
+            <w:vAlign w:val="center"/>
+          </w:tcPr>
+          <w:p>
+            <w:pPr>
+              <w:spacing w:before="100" w:after="100"/>
+              <w:ind w:firstLine="0"/>
+              <w:jc w:val="left"/>
+            </w:pPr>
+          </w:p>
+        </w:tc>
+        <w:tc>
+          <w:tcPr>
+            <w:tcW w:type="dxa" w:w="3996"/>
+            <w:vAlign w:val="center"/>
+          </w:tcPr>
+          <w:p>
+            <w:pPr>
+              <w:spacing w:before="100" w:after="100"/>
+              <w:ind w:firstLine="0"/>
+              <w:jc w:val="center"/>
+            </w:pPr>
+            <m:oMathPara>
+              <m:oMathParaPr>
+                <m:jc m:val="center"/>
+              </m:oMathParaPr>
+              <m:oMath>
+                <m:sSubSup>
+                  <m:e>
+                    <m:r>
+                      <w:rPr>
+                        <w:rFonts w:ascii="Cambria Math" w:hAnsi="Cambria Math"/>
+                        <w:sz w:val="20"/>
+                      </w:rPr>
+                      <m:t xml:space="preserve">z</m:t>
+                    </m:r>
+                  </m:e>
+                  <m:sub>
+                    <m:r>
+                      <w:rPr>
+                        <w:rFonts w:ascii="Cambria Math" w:hAnsi="Cambria Math"/>
+                        <w:sz w:val="20"/>
+                      </w:rPr>
+                      <m:t xml:space="preserve">i</m:t>
+                    </m:r>
+                  </m:sub>
+                  <m:sup>
+                    <m:r>
+                      <w:rPr>
+                        <w:rFonts w:ascii="Cambria Math" w:hAnsi="Cambria Math"/>
+                        <w:sz w:val="20"/>
+                      </w:rPr>
+                      <m:t xml:space="preserve">x</m:t>
+                    </m:r>
+                  </m:sup>
+                </m:sSubSup>
+                <m:r>
+                  <w:rPr>
+                    <w:rFonts w:ascii="Cambria Math" w:hAnsi="Cambria Math"/>
+                    <w:sz w:val="20"/>
+                  </w:rPr>
+                  <m:t xml:space="preserve">=</m:t>
+                </m:r>
+                <m:f>
+                  <m:num>
+                    <m:sSub>
+                      <m:e>
+                        <m:r>
+                          <w:rPr>
+                            <w:rFonts w:ascii="Cambria Math" w:hAnsi="Cambria Math"/>
+                            <w:sz w:val="20"/>
+                          </w:rPr>
+                          <m:t xml:space="preserve">x</m:t>
+                        </m:r>
+                      </m:e>
+                      <m:sub>
+                        <m:r>
+                          <w:rPr>
+                            <w:rFonts w:ascii="Cambria Math" w:hAnsi="Cambria Math"/>
+                            <w:sz w:val="20"/>
+                          </w:rPr>
+                          <m:t xml:space="preserve">i</m:t>
+                        </m:r>
+                      </m:sub>
+                    </m:sSub>
+                    <m:r>
+                      <w:rPr>
+                        <w:rFonts w:ascii="Cambria Math" w:hAnsi="Cambria Math"/>
+                        <w:sz w:val="20"/>
+                      </w:rPr>
+                      <m:t xml:space="preserve">−</m:t>
+                    </m:r>
+                    <m:sSubSup>
+                      <m:e>
+                        <m:r>
+                          <w:rPr>
+                            <w:rFonts w:ascii="Cambria Math" w:hAnsi="Cambria Math"/>
+                            <w:sz w:val="20"/>
+                          </w:rPr>
+                          <m:t xml:space="preserve">q</m:t>
+                        </m:r>
+                      </m:e>
+                      <m:sub>
+                        <m:r>
+                          <w:rPr>
+                            <w:rFonts w:ascii="Cambria Math" w:hAnsi="Cambria Math"/>
+                            <w:sz w:val="20"/>
+                          </w:rPr>
+                          <m:t xml:space="preserve">0.25</m:t>
+                        </m:r>
+                      </m:sub>
+                      <m:sup>
+                        <m:r>
+                          <w:rPr>
+                            <w:rFonts w:ascii="Cambria Math" w:hAnsi="Cambria Math"/>
+                            <w:sz w:val="20"/>
+                          </w:rPr>
+                          <m:t xml:space="preserve">x</m:t>
+                        </m:r>
+                      </m:sup>
+                    </m:sSubSup>
+                  </m:num>
+                  <m:den>
+                    <m:func>
+                      <m:fName>
+                        <m:r>
+                          <m:rPr>
+                            <m:nor/>
+                          </m:rPr>
+                          <w:rPr>
+                            <w:rFonts w:ascii="Cambria Math" w:hAnsi="Cambria Math"/>
+                            <w:sz w:val="20"/>
+                          </w:rPr>
+                          <m:t xml:space="preserve">max</m:t>
+                        </m:r>
+                      </m:fName>
+                      <m:e>
+                        <m:d>
+                          <m:dPr>
+                            <m:begChr m:val="("/>
+                            <m:endChr m:val=")"/>
+                          </m:dPr>
+                          <m:e>
+                            <m:sSubSup>
+                              <m:e>
+                                <m:r>
+                                  <m:rPr>
+                                    <m:nor/>
+                                  </m:rPr>
+                                  <w:rPr>
+                                    <w:rFonts w:ascii="Cambria Math" w:hAnsi="Cambria Math"/>
+                                    <w:sz w:val="20"/>
+                                  </w:rPr>
+                                  <m:t xml:space="preserve">IQR</m:t>
+                                </m:r>
+                              </m:e>
+                              <m:sub>
+                                <m:r>
+                                  <w:rPr>
+                                    <w:rFonts w:ascii="Cambria Math" w:hAnsi="Cambria Math"/>
+                                    <w:sz w:val="20"/>
+                                  </w:rPr>
+                                  <m:t xml:space="preserve">i</m:t>
+                                </m:r>
+                              </m:sub>
+                              <m:sup>
+                                <m:r>
+                                  <w:rPr>
+                                    <w:rFonts w:ascii="Cambria Math" w:hAnsi="Cambria Math"/>
+                                    <w:sz w:val="20"/>
+                                  </w:rPr>
+                                  <m:t xml:space="preserve">x</m:t>
+                                </m:r>
+                              </m:sup>
+                            </m:sSubSup>
+                            <m:r>
+                              <w:rPr>
+                                <w:rFonts w:ascii="Cambria Math" w:hAnsi="Cambria Math"/>
+                                <w:sz w:val="20"/>
+                              </w:rPr>
+                              <m:t xml:space="preserve">,</m:t>
+                            </m:r>
+                            <m:r>
+                              <w:rPr>
+                                <w:rFonts w:ascii="Cambria Math" w:hAnsi="Cambria Math"/>
+                                <w:sz w:val="20"/>
+                              </w:rPr>
+                              <m:t xml:space="preserve">1</m:t>
+                            </m:r>
+                          </m:e>
+                        </m:d>
+                      </m:e>
+                    </m:func>
+                  </m:den>
+                </m:f>
+                <m:r>
+                  <w:rPr>
+                    <w:rFonts w:ascii="Cambria Math" w:hAnsi="Cambria Math"/>
+                    <w:sz w:val="20"/>
+                  </w:rPr>
+                  <m:t xml:space="preserve">.</m:t>
+                </m:r>
+              </m:oMath>
+            </m:oMathPara>
+          </w:p>
+        </w:tc>
+        <w:tc>
+          <w:tcPr>
+            <w:tcW w:type="dxa" w:w="504"/>
+            <w:vAlign w:val="center"/>
+          </w:tcPr>
+          <w:p>
+            <w:pPr>
+              <w:spacing w:before="100" w:after="100"/>
+              <w:ind w:firstLine="0"/>
+              <w:jc w:val="right"/>
+            </w:pPr>
+            <w:r>
+              <w:t>(2)</w:t>
+            </w:r>
+          </w:p>
+        </w:tc>
+      </w:tr>
+    </w:tbl>
     <w:p>
       <w:pPr>
         <w:spacing w:before="0" w:after="0"/>
         <w:jc w:val="both"/>
       </w:pPr>
       <w:r>
-        <w:t>Here, x is either sound s or acceleration a; ^x identifies the signal rather than an exponent. Time arguments are omitted in (2), and IQR_i^x = q_0.75^x - q_0.25^x.</w:t>
+        <w:t xml:space="preserve">Here, </w:t>
+      </w:r>
+      <m:oMath>
+        <m:r>
+          <w:rPr>
+            <w:rFonts w:ascii="Cambria Math" w:hAnsi="Cambria Math"/>
+            <w:sz w:val="20"/>
+          </w:rPr>
+          <m:t xml:space="preserve">x</m:t>
+        </m:r>
+      </m:oMath>
+      <w:r>
+        <w:t xml:space="preserve"> is either sound </w:t>
+      </w:r>
+      <m:oMath>
+        <m:r>
+          <w:rPr>
+            <w:rFonts w:ascii="Cambria Math" w:hAnsi="Cambria Math"/>
+            <w:sz w:val="20"/>
+          </w:rPr>
+          <m:t xml:space="preserve">s</m:t>
+        </m:r>
+      </m:oMath>
+      <w:r>
+        <w:t xml:space="preserve"> or acceleration </w:t>
+      </w:r>
+      <m:oMath>
+        <m:r>
+          <w:rPr>
+            <w:rFonts w:ascii="Cambria Math" w:hAnsi="Cambria Math"/>
+            <w:sz w:val="20"/>
+          </w:rPr>
+          <m:t xml:space="preserve">a</m:t>
+        </m:r>
+      </m:oMath>
+      <w:r>
+        <w:t xml:space="preserve">; the superscript </w:t>
+      </w:r>
+      <m:oMath>
+        <m:r>
+          <w:rPr>
+            <w:rFonts w:ascii="Cambria Math" w:hAnsi="Cambria Math"/>
+            <w:sz w:val="20"/>
+          </w:rPr>
+          <m:t xml:space="preserve">x</m:t>
+        </m:r>
+      </m:oMath>
+      <w:r>
+        <w:t xml:space="preserve"> identifies the signal rather than an exponent. Time arguments are omitted in (2), and </w:t>
+      </w:r>
+      <m:oMath>
+        <m:sSubSup>
+          <m:e>
+            <m:r>
+              <m:rPr>
+                <m:nor/>
+              </m:rPr>
+              <w:rPr>
+                <w:rFonts w:ascii="Cambria Math" w:hAnsi="Cambria Math"/>
+                <w:sz w:val="20"/>
+              </w:rPr>
+              <m:t xml:space="preserve">IQR</m:t>
+            </m:r>
+          </m:e>
+          <m:sub>
+            <m:r>
+              <w:rPr>
+                <w:rFonts w:ascii="Cambria Math" w:hAnsi="Cambria Math"/>
+                <w:sz w:val="20"/>
+              </w:rPr>
+              <m:t xml:space="preserve">i</m:t>
+            </m:r>
+          </m:sub>
+          <m:sup>
+            <m:r>
+              <w:rPr>
+                <w:rFonts w:ascii="Cambria Math" w:hAnsi="Cambria Math"/>
+                <w:sz w:val="20"/>
+              </w:rPr>
+              <m:t xml:space="preserve">x</m:t>
+            </m:r>
+          </m:sup>
+        </m:sSubSup>
+        <m:r>
+          <w:rPr>
+            <w:rFonts w:ascii="Cambria Math" w:hAnsi="Cambria Math"/>
+            <w:sz w:val="20"/>
+          </w:rPr>
+          <m:t xml:space="preserve">=</m:t>
+        </m:r>
+        <m:sSubSup>
+          <m:e>
+            <m:r>
+              <w:rPr>
+                <w:rFonts w:ascii="Cambria Math" w:hAnsi="Cambria Math"/>
+                <w:sz w:val="20"/>
+              </w:rPr>
+              <m:t xml:space="preserve">q</m:t>
+            </m:r>
+          </m:e>
+          <m:sub>
+            <m:r>
+              <w:rPr>
+                <w:rFonts w:ascii="Cambria Math" w:hAnsi="Cambria Math"/>
+                <w:sz w:val="20"/>
+              </w:rPr>
+              <m:t xml:space="preserve">0.75</m:t>
+            </m:r>
+          </m:sub>
+          <m:sup>
+            <m:r>
+              <w:rPr>
+                <w:rFonts w:ascii="Cambria Math" w:hAnsi="Cambria Math"/>
+                <w:sz w:val="20"/>
+              </w:rPr>
+              <m:t xml:space="preserve">x</m:t>
+            </m:r>
+          </m:sup>
+        </m:sSubSup>
+        <m:r>
+          <w:rPr>
+            <w:rFonts w:ascii="Cambria Math" w:hAnsi="Cambria Math"/>
+            <w:sz w:val="20"/>
+          </w:rPr>
+          <m:t xml:space="preserve">−</m:t>
+        </m:r>
+        <m:sSubSup>
+          <m:e>
+            <m:r>
+              <w:rPr>
+                <w:rFonts w:ascii="Cambria Math" w:hAnsi="Cambria Math"/>
+                <w:sz w:val="20"/>
+              </w:rPr>
+              <m:t xml:space="preserve">q</m:t>
+            </m:r>
+          </m:e>
+          <m:sub>
+            <m:r>
+              <w:rPr>
+                <w:rFonts w:ascii="Cambria Math" w:hAnsi="Cambria Math"/>
+                <w:sz w:val="20"/>
+              </w:rPr>
+              <m:t xml:space="preserve">0.25</m:t>
+            </m:r>
+          </m:sub>
+          <m:sup>
+            <m:r>
+              <w:rPr>
+                <w:rFonts w:ascii="Cambria Math" w:hAnsi="Cambria Math"/>
+                <w:sz w:val="20"/>
+              </w:rPr>
+              <m:t xml:space="preserve">x</m:t>
+            </m:r>
+          </m:sup>
+        </m:sSubSup>
+      </m:oMath>
+      <w:r>
+        <w:t>.</w:t>
       </w:r>
     </w:p>
     <w:p>
@@ -442,26 +1320,303 @@
         <w:t>The combined score is</w:t>
       </w:r>
     </w:p>
-    <w:p>
-      <w:pPr>
-        <w:keepNext w:val="0"/>
-        <w:tabs>
-          <w:tab w:pos="2502" w:val="center"/>
-          <w:tab w:pos="5004" w:val="right"/>
-        </w:tabs>
-        <w:spacing w:before="100" w:after="100"/>
-        <w:ind w:firstLine="0"/>
-      </w:pPr>
-      <w:r>
-        <w:rPr>
-          <w:sz w:val="18"/>
-        </w:rPr>
-        <w:tab/>
-        <w:t>c_i(t) = z_i^s(t) + 1.2 * clip(z_i^a(t), 0, 2.5).</w:t>
-        <w:tab/>
-        <w:t>(3)</w:t>
-      </w:r>
-    </w:p>
+    <w:tbl>
+      <w:tblPr>
+        <w:tblW w:type="auto" w:w="0"/>
+        <w:jc w:val="center"/>
+        <w:tblLayout w:type="fixed"/>
+        <w:tblLook w:firstColumn="1" w:firstRow="1" w:lastColumn="0" w:lastRow="0" w:noHBand="0" w:noVBand="1" w:val="04A0"/>
+        <w:tblLayout w:type="fixed"/>
+        <w:tblCellMar>
+          <w:left w:w="0" w:type="dxa"/>
+          <w:right w:w="0" w:type="dxa"/>
+        </w:tblCellMar>
+      </w:tblPr>
+      <w:tblGrid>
+        <w:gridCol w:w="504"/>
+        <w:gridCol w:w="3996"/>
+        <w:gridCol w:w="504"/>
+      </w:tblGrid>
+      <w:tr>
+        <w:tc>
+          <w:tcPr>
+            <w:tcW w:type="dxa" w:w="504"/>
+            <w:vAlign w:val="center"/>
+          </w:tcPr>
+          <w:p>
+            <w:pPr>
+              <w:spacing w:before="100" w:after="100"/>
+              <w:ind w:firstLine="0"/>
+              <w:jc w:val="left"/>
+            </w:pPr>
+          </w:p>
+        </w:tc>
+        <w:tc>
+          <w:tcPr>
+            <w:tcW w:type="dxa" w:w="3996"/>
+            <w:vAlign w:val="center"/>
+          </w:tcPr>
+          <w:p>
+            <w:pPr>
+              <w:spacing w:before="100" w:after="100"/>
+              <w:ind w:firstLine="0"/>
+              <w:jc w:val="center"/>
+            </w:pPr>
+            <m:oMathPara>
+              <m:oMathParaPr>
+                <m:jc m:val="center"/>
+              </m:oMathParaPr>
+              <m:oMath>
+                <m:sSub>
+                  <m:e>
+                    <m:r>
+                      <w:rPr>
+                        <w:rFonts w:ascii="Cambria Math" w:hAnsi="Cambria Math"/>
+                        <w:sz w:val="20"/>
+                      </w:rPr>
+                      <m:t xml:space="preserve">c</m:t>
+                    </m:r>
+                  </m:e>
+                  <m:sub>
+                    <m:r>
+                      <w:rPr>
+                        <w:rFonts w:ascii="Cambria Math" w:hAnsi="Cambria Math"/>
+                        <w:sz w:val="20"/>
+                      </w:rPr>
+                      <m:t xml:space="preserve">i</m:t>
+                    </m:r>
+                  </m:sub>
+                </m:sSub>
+                <m:r>
+                  <w:rPr>
+                    <w:rFonts w:ascii="Cambria Math" w:hAnsi="Cambria Math"/>
+                    <w:sz w:val="20"/>
+                  </w:rPr>
+                  <m:t xml:space="preserve">(</m:t>
+                </m:r>
+                <m:r>
+                  <w:rPr>
+                    <w:rFonts w:ascii="Cambria Math" w:hAnsi="Cambria Math"/>
+                    <w:sz w:val="20"/>
+                  </w:rPr>
+                  <m:t xml:space="preserve">t</m:t>
+                </m:r>
+                <m:r>
+                  <w:rPr>
+                    <w:rFonts w:ascii="Cambria Math" w:hAnsi="Cambria Math"/>
+                    <w:sz w:val="20"/>
+                  </w:rPr>
+                  <m:t xml:space="preserve">)</m:t>
+                </m:r>
+                <m:r>
+                  <w:rPr>
+                    <w:rFonts w:ascii="Cambria Math" w:hAnsi="Cambria Math"/>
+                    <w:sz w:val="20"/>
+                  </w:rPr>
+                  <m:t xml:space="preserve">=</m:t>
+                </m:r>
+                <m:sSubSup>
+                  <m:e>
+                    <m:r>
+                      <w:rPr>
+                        <w:rFonts w:ascii="Cambria Math" w:hAnsi="Cambria Math"/>
+                        <w:sz w:val="20"/>
+                      </w:rPr>
+                      <m:t xml:space="preserve">z</m:t>
+                    </m:r>
+                  </m:e>
+                  <m:sub>
+                    <m:r>
+                      <w:rPr>
+                        <w:rFonts w:ascii="Cambria Math" w:hAnsi="Cambria Math"/>
+                        <w:sz w:val="20"/>
+                      </w:rPr>
+                      <m:t xml:space="preserve">i</m:t>
+                    </m:r>
+                  </m:sub>
+                  <m:sup>
+                    <m:r>
+                      <w:rPr>
+                        <w:rFonts w:ascii="Cambria Math" w:hAnsi="Cambria Math"/>
+                        <w:sz w:val="20"/>
+                      </w:rPr>
+                      <m:t xml:space="preserve">s</m:t>
+                    </m:r>
+                  </m:sup>
+                </m:sSubSup>
+                <m:r>
+                  <w:rPr>
+                    <w:rFonts w:ascii="Cambria Math" w:hAnsi="Cambria Math"/>
+                    <w:sz w:val="20"/>
+                  </w:rPr>
+                  <m:t xml:space="preserve">(</m:t>
+                </m:r>
+                <m:r>
+                  <w:rPr>
+                    <w:rFonts w:ascii="Cambria Math" w:hAnsi="Cambria Math"/>
+                    <w:sz w:val="20"/>
+                  </w:rPr>
+                  <m:t xml:space="preserve">t</m:t>
+                </m:r>
+                <m:r>
+                  <w:rPr>
+                    <w:rFonts w:ascii="Cambria Math" w:hAnsi="Cambria Math"/>
+                    <w:sz w:val="20"/>
+                  </w:rPr>
+                  <m:t xml:space="preserve">)</m:t>
+                </m:r>
+                <m:r>
+                  <w:rPr>
+                    <w:rFonts w:ascii="Cambria Math" w:hAnsi="Cambria Math"/>
+                    <w:sz w:val="20"/>
+                  </w:rPr>
+                  <m:t xml:space="preserve">+</m:t>
+                </m:r>
+                <m:r>
+                  <w:rPr>
+                    <w:rFonts w:ascii="Cambria Math" w:hAnsi="Cambria Math"/>
+                    <w:sz w:val="20"/>
+                  </w:rPr>
+                  <m:t xml:space="preserve">1.2</m:t>
+                </m:r>
+                <m:r>
+                  <w:rPr>
+                    <w:rFonts w:ascii="Cambria Math" w:hAnsi="Cambria Math"/>
+                    <w:sz w:val="20"/>
+                  </w:rPr>
+                  <m:t xml:space="preserve">⋅</m:t>
+                </m:r>
+                <m:func>
+                  <m:fName>
+                    <m:r>
+                      <m:rPr>
+                        <m:nor/>
+                      </m:rPr>
+                      <w:rPr>
+                        <w:rFonts w:ascii="Cambria Math" w:hAnsi="Cambria Math"/>
+                        <w:sz w:val="20"/>
+                      </w:rPr>
+                      <m:t xml:space="preserve">clip</m:t>
+                    </m:r>
+                  </m:fName>
+                  <m:e>
+                    <m:d>
+                      <m:dPr>
+                        <m:begChr m:val="("/>
+                        <m:endChr m:val=")"/>
+                      </m:dPr>
+                      <m:e>
+                        <m:sSubSup>
+                          <m:e>
+                            <m:r>
+                              <w:rPr>
+                                <w:rFonts w:ascii="Cambria Math" w:hAnsi="Cambria Math"/>
+                                <w:sz w:val="20"/>
+                              </w:rPr>
+                              <m:t xml:space="preserve">z</m:t>
+                            </m:r>
+                          </m:e>
+                          <m:sub>
+                            <m:r>
+                              <w:rPr>
+                                <w:rFonts w:ascii="Cambria Math" w:hAnsi="Cambria Math"/>
+                                <w:sz w:val="20"/>
+                              </w:rPr>
+                              <m:t xml:space="preserve">i</m:t>
+                            </m:r>
+                          </m:sub>
+                          <m:sup>
+                            <m:r>
+                              <w:rPr>
+                                <w:rFonts w:ascii="Cambria Math" w:hAnsi="Cambria Math"/>
+                                <w:sz w:val="20"/>
+                              </w:rPr>
+                              <m:t xml:space="preserve">a</m:t>
+                            </m:r>
+                          </m:sup>
+                        </m:sSubSup>
+                        <m:r>
+                          <w:rPr>
+                            <w:rFonts w:ascii="Cambria Math" w:hAnsi="Cambria Math"/>
+                            <w:sz w:val="20"/>
+                          </w:rPr>
+                          <m:t xml:space="preserve">(</m:t>
+                        </m:r>
+                        <m:r>
+                          <w:rPr>
+                            <w:rFonts w:ascii="Cambria Math" w:hAnsi="Cambria Math"/>
+                            <w:sz w:val="20"/>
+                          </w:rPr>
+                          <m:t xml:space="preserve">t</m:t>
+                        </m:r>
+                        <m:r>
+                          <w:rPr>
+                            <w:rFonts w:ascii="Cambria Math" w:hAnsi="Cambria Math"/>
+                            <w:sz w:val="20"/>
+                          </w:rPr>
+                          <m:t xml:space="preserve">)</m:t>
+                        </m:r>
+                        <m:r>
+                          <w:rPr>
+                            <w:rFonts w:ascii="Cambria Math" w:hAnsi="Cambria Math"/>
+                            <w:sz w:val="20"/>
+                          </w:rPr>
+                          <m:t xml:space="preserve">,</m:t>
+                        </m:r>
+                        <m:r>
+                          <w:rPr>
+                            <w:rFonts w:ascii="Cambria Math" w:hAnsi="Cambria Math"/>
+                            <w:sz w:val="20"/>
+                          </w:rPr>
+                          <m:t xml:space="preserve">0</m:t>
+                        </m:r>
+                        <m:r>
+                          <w:rPr>
+                            <w:rFonts w:ascii="Cambria Math" w:hAnsi="Cambria Math"/>
+                            <w:sz w:val="20"/>
+                          </w:rPr>
+                          <m:t xml:space="preserve">,</m:t>
+                        </m:r>
+                        <m:r>
+                          <w:rPr>
+                            <w:rFonts w:ascii="Cambria Math" w:hAnsi="Cambria Math"/>
+                            <w:sz w:val="20"/>
+                          </w:rPr>
+                          <m:t xml:space="preserve">2.5</m:t>
+                        </m:r>
+                      </m:e>
+                    </m:d>
+                  </m:e>
+                </m:func>
+                <m:r>
+                  <w:rPr>
+                    <w:rFonts w:ascii="Cambria Math" w:hAnsi="Cambria Math"/>
+                    <w:sz w:val="20"/>
+                  </w:rPr>
+                  <m:t xml:space="preserve">.</m:t>
+                </m:r>
+              </m:oMath>
+            </m:oMathPara>
+          </w:p>
+        </w:tc>
+        <w:tc>
+          <w:tcPr>
+            <w:tcW w:type="dxa" w:w="504"/>
+            <w:vAlign w:val="center"/>
+          </w:tcPr>
+          <w:p>
+            <w:pPr>
+              <w:spacing w:before="100" w:after="100"/>
+              <w:ind w:firstLine="0"/>
+              <w:jc w:val="right"/>
+            </w:pPr>
+            <w:r>
+              <w:t>(3)</w:t>
+            </w:r>
+          </w:p>
+        </w:tc>
+      </w:tr>
+    </w:tbl>
     <w:p>
       <w:pPr>
         <w:spacing w:before="0" w:after="0"/>
@@ -843,56 +1998,702 @@
         <w:jc w:val="both"/>
       </w:pPr>
       <w:r>
-        <w:t>Let d_i denote the total estimated speaking duration of participant i and p_i = d_i / sum_j(d_j). Participation summaries include the dominant-speaker fraction max_i(p_i), normalized entropy, and the Gini coefficient:</w:t>
+        <w:t xml:space="preserve">Let </w:t>
+      </w:r>
+      <m:oMath>
+        <m:sSub>
+          <m:e>
+            <m:r>
+              <w:rPr>
+                <w:rFonts w:ascii="Cambria Math" w:hAnsi="Cambria Math"/>
+                <w:sz w:val="20"/>
+              </w:rPr>
+              <m:t xml:space="preserve">d</m:t>
+            </m:r>
+          </m:e>
+          <m:sub>
+            <m:r>
+              <w:rPr>
+                <w:rFonts w:ascii="Cambria Math" w:hAnsi="Cambria Math"/>
+                <w:sz w:val="20"/>
+              </w:rPr>
+              <m:t xml:space="preserve">i</m:t>
+            </m:r>
+          </m:sub>
+        </m:sSub>
+      </m:oMath>
+      <w:r>
+        <w:t xml:space="preserve"> denote the total estimated speaking duration of participant </w:t>
+      </w:r>
+      <m:oMath>
+        <m:r>
+          <w:rPr>
+            <w:rFonts w:ascii="Cambria Math" w:hAnsi="Cambria Math"/>
+            <w:sz w:val="20"/>
+          </w:rPr>
+          <m:t xml:space="preserve">i</m:t>
+        </m:r>
+      </m:oMath>
+      <w:r>
+        <w:t xml:space="preserve"> and </w:t>
+      </w:r>
+      <m:oMath>
+        <m:sSub>
+          <m:e>
+            <m:r>
+              <w:rPr>
+                <w:rFonts w:ascii="Cambria Math" w:hAnsi="Cambria Math"/>
+                <w:sz w:val="20"/>
+              </w:rPr>
+              <m:t xml:space="preserve">p</m:t>
+            </m:r>
+          </m:e>
+          <m:sub>
+            <m:r>
+              <w:rPr>
+                <w:rFonts w:ascii="Cambria Math" w:hAnsi="Cambria Math"/>
+                <w:sz w:val="20"/>
+              </w:rPr>
+              <m:t xml:space="preserve">i</m:t>
+            </m:r>
+          </m:sub>
+        </m:sSub>
+        <m:r>
+          <w:rPr>
+            <w:rFonts w:ascii="Cambria Math" w:hAnsi="Cambria Math"/>
+            <w:sz w:val="20"/>
+          </w:rPr>
+          <m:t xml:space="preserve">=</m:t>
+        </m:r>
+        <m:sSub>
+          <m:e>
+            <m:r>
+              <w:rPr>
+                <w:rFonts w:ascii="Cambria Math" w:hAnsi="Cambria Math"/>
+                <w:sz w:val="20"/>
+              </w:rPr>
+              <m:t xml:space="preserve">d</m:t>
+            </m:r>
+          </m:e>
+          <m:sub>
+            <m:r>
+              <w:rPr>
+                <w:rFonts w:ascii="Cambria Math" w:hAnsi="Cambria Math"/>
+                <w:sz w:val="20"/>
+              </w:rPr>
+              <m:t xml:space="preserve">i</m:t>
+            </m:r>
+          </m:sub>
+        </m:sSub>
+        <m:r>
+          <w:rPr>
+            <w:rFonts w:ascii="Cambria Math" w:hAnsi="Cambria Math"/>
+            <w:sz w:val="20"/>
+          </w:rPr>
+          <m:t xml:space="preserve">/</m:t>
+        </m:r>
+        <m:nary>
+          <m:naryPr>
+            <m:chr m:val="∑"/>
+            <m:limLoc m:val="subSup"/>
+            <m:supHide m:val="1"/>
+          </m:naryPr>
+          <m:sub>
+            <m:r>
+              <w:rPr>
+                <w:rFonts w:ascii="Cambria Math" w:hAnsi="Cambria Math"/>
+                <w:sz w:val="20"/>
+              </w:rPr>
+              <m:t xml:space="preserve">j</m:t>
+            </m:r>
+          </m:sub>
+          <m:sup/>
+          <m:e>
+            <m:sSub>
+              <m:e>
+                <m:r>
+                  <w:rPr>
+                    <w:rFonts w:ascii="Cambria Math" w:hAnsi="Cambria Math"/>
+                    <w:sz w:val="20"/>
+                  </w:rPr>
+                  <m:t xml:space="preserve">d</m:t>
+                </m:r>
+              </m:e>
+              <m:sub>
+                <m:r>
+                  <w:rPr>
+                    <w:rFonts w:ascii="Cambria Math" w:hAnsi="Cambria Math"/>
+                    <w:sz w:val="20"/>
+                  </w:rPr>
+                  <m:t xml:space="preserve">j</m:t>
+                </m:r>
+              </m:sub>
+            </m:sSub>
+          </m:e>
+        </m:nary>
+      </m:oMath>
+      <w:r>
+        <w:t xml:space="preserve">. Participation summaries include the dominant-speaker fraction </w:t>
+      </w:r>
+      <m:oMath>
+        <m:func>
+          <m:fName>
+            <m:sSub>
+              <m:e>
+                <m:r>
+                  <m:rPr>
+                    <m:nor/>
+                  </m:rPr>
+                  <w:rPr>
+                    <w:rFonts w:ascii="Cambria Math" w:hAnsi="Cambria Math"/>
+                    <w:sz w:val="20"/>
+                  </w:rPr>
+                  <m:t xml:space="preserve">max</m:t>
+                </m:r>
+              </m:e>
+              <m:sub>
+                <m:r>
+                  <w:rPr>
+                    <w:rFonts w:ascii="Cambria Math" w:hAnsi="Cambria Math"/>
+                    <w:sz w:val="20"/>
+                  </w:rPr>
+                  <m:t xml:space="preserve">i</m:t>
+                </m:r>
+              </m:sub>
+            </m:sSub>
+          </m:fName>
+          <m:e>
+            <m:sSub>
+              <m:e>
+                <m:r>
+                  <w:rPr>
+                    <w:rFonts w:ascii="Cambria Math" w:hAnsi="Cambria Math"/>
+                    <w:sz w:val="20"/>
+                  </w:rPr>
+                  <m:t xml:space="preserve">p</m:t>
+                </m:r>
+              </m:e>
+              <m:sub>
+                <m:r>
+                  <w:rPr>
+                    <w:rFonts w:ascii="Cambria Math" w:hAnsi="Cambria Math"/>
+                    <w:sz w:val="20"/>
+                  </w:rPr>
+                  <m:t xml:space="preserve">i</m:t>
+                </m:r>
+              </m:sub>
+            </m:sSub>
+          </m:e>
+        </m:func>
+      </m:oMath>
+      <w:r>
+        <w:t>, normalized entropy, and the Gini coefficient:</w:t>
       </w:r>
     </w:p>
-    <w:p>
-      <w:pPr>
-        <w:keepNext w:val="0"/>
-        <w:tabs>
-          <w:tab w:pos="2502" w:val="center"/>
-          <w:tab w:pos="5004" w:val="right"/>
-        </w:tabs>
-        <w:spacing w:before="100" w:after="100"/>
-        <w:ind w:firstLine="0"/>
-      </w:pPr>
-      <w:r>
-        <w:rPr>
-          <w:sz w:val="18"/>
-        </w:rPr>
-        <w:tab/>
-        <w:t>H = -sum_i(p_i * ln(p_i)) / ln(n).</w:t>
-        <w:tab/>
-        <w:t>(4)</w:t>
-      </w:r>
-    </w:p>
-    <w:p>
-      <w:pPr>
-        <w:keepNext w:val="0"/>
-        <w:tabs>
-          <w:tab w:pos="2502" w:val="center"/>
-          <w:tab w:pos="5004" w:val="right"/>
-        </w:tabs>
-        <w:spacing w:before="100" w:after="100"/>
-        <w:ind w:firstLine="0"/>
-      </w:pPr>
-      <w:r>
-        <w:rPr>
-          <w:sz w:val="18"/>
-        </w:rPr>
-        <w:tab/>
-        <w:t>G = sum_i sum_j |d_i - d_j| / (2n sum_i d_i).</w:t>
-        <w:tab/>
-        <w:t>(5)</w:t>
-      </w:r>
-    </w:p>
+    <w:tbl>
+      <w:tblPr>
+        <w:tblW w:type="auto" w:w="0"/>
+        <w:jc w:val="center"/>
+        <w:tblLayout w:type="fixed"/>
+        <w:tblLook w:firstColumn="1" w:firstRow="1" w:lastColumn="0" w:lastRow="0" w:noHBand="0" w:noVBand="1" w:val="04A0"/>
+        <w:tblLayout w:type="fixed"/>
+        <w:tblCellMar>
+          <w:left w:w="0" w:type="dxa"/>
+          <w:right w:w="0" w:type="dxa"/>
+        </w:tblCellMar>
+      </w:tblPr>
+      <w:tblGrid>
+        <w:gridCol w:w="504"/>
+        <w:gridCol w:w="3996"/>
+        <w:gridCol w:w="504"/>
+      </w:tblGrid>
+      <w:tr>
+        <w:tc>
+          <w:tcPr>
+            <w:tcW w:type="dxa" w:w="504"/>
+            <w:vAlign w:val="center"/>
+          </w:tcPr>
+          <w:p>
+            <w:pPr>
+              <w:spacing w:before="100" w:after="100"/>
+              <w:ind w:firstLine="0"/>
+              <w:jc w:val="left"/>
+            </w:pPr>
+          </w:p>
+        </w:tc>
+        <w:tc>
+          <w:tcPr>
+            <w:tcW w:type="dxa" w:w="3996"/>
+            <w:vAlign w:val="center"/>
+          </w:tcPr>
+          <w:p>
+            <w:pPr>
+              <w:spacing w:before="100" w:after="100"/>
+              <w:ind w:firstLine="0"/>
+              <w:jc w:val="center"/>
+            </w:pPr>
+            <m:oMathPara>
+              <m:oMathParaPr>
+                <m:jc m:val="center"/>
+              </m:oMathParaPr>
+              <m:oMath>
+                <m:r>
+                  <w:rPr>
+                    <w:rFonts w:ascii="Cambria Math" w:hAnsi="Cambria Math"/>
+                    <w:sz w:val="20"/>
+                  </w:rPr>
+                  <m:t xml:space="preserve">H</m:t>
+                </m:r>
+                <m:r>
+                  <w:rPr>
+                    <w:rFonts w:ascii="Cambria Math" w:hAnsi="Cambria Math"/>
+                    <w:sz w:val="20"/>
+                  </w:rPr>
+                  <m:t xml:space="preserve">=</m:t>
+                </m:r>
+                <m:r>
+                  <w:rPr>
+                    <w:rFonts w:ascii="Cambria Math" w:hAnsi="Cambria Math"/>
+                    <w:sz w:val="20"/>
+                  </w:rPr>
+                  <m:t xml:space="preserve">−</m:t>
+                </m:r>
+                <m:f>
+                  <m:num>
+                    <m:nary>
+                      <m:naryPr>
+                        <m:chr m:val="∑"/>
+                        <m:limLoc m:val="undOvr"/>
+                        <m:supHide m:val="1"/>
+                      </m:naryPr>
+                      <m:sub>
+                        <m:r>
+                          <w:rPr>
+                            <w:rFonts w:ascii="Cambria Math" w:hAnsi="Cambria Math"/>
+                            <w:sz w:val="20"/>
+                          </w:rPr>
+                          <m:t xml:space="preserve">i</m:t>
+                        </m:r>
+                      </m:sub>
+                      <m:sup/>
+                      <m:e>
+                        <m:sSub>
+                          <m:e>
+                            <m:r>
+                              <w:rPr>
+                                <w:rFonts w:ascii="Cambria Math" w:hAnsi="Cambria Math"/>
+                                <w:sz w:val="20"/>
+                              </w:rPr>
+                              <m:t xml:space="preserve">p</m:t>
+                            </m:r>
+                          </m:e>
+                          <m:sub>
+                            <m:r>
+                              <w:rPr>
+                                <w:rFonts w:ascii="Cambria Math" w:hAnsi="Cambria Math"/>
+                                <w:sz w:val="20"/>
+                              </w:rPr>
+                              <m:t xml:space="preserve">i</m:t>
+                            </m:r>
+                          </m:sub>
+                        </m:sSub>
+                        <m:func>
+                          <m:fName>
+                            <m:r>
+                              <m:rPr>
+                                <m:nor/>
+                              </m:rPr>
+                              <w:rPr>
+                                <w:rFonts w:ascii="Cambria Math" w:hAnsi="Cambria Math"/>
+                                <w:sz w:val="20"/>
+                              </w:rPr>
+                              <m:t xml:space="preserve">ln</m:t>
+                            </m:r>
+                          </m:fName>
+                          <m:e>
+                            <m:sSub>
+                              <m:e>
+                                <m:r>
+                                  <w:rPr>
+                                    <w:rFonts w:ascii="Cambria Math" w:hAnsi="Cambria Math"/>
+                                    <w:sz w:val="20"/>
+                                  </w:rPr>
+                                  <m:t xml:space="preserve">p</m:t>
+                                </m:r>
+                              </m:e>
+                              <m:sub>
+                                <m:r>
+                                  <w:rPr>
+                                    <w:rFonts w:ascii="Cambria Math" w:hAnsi="Cambria Math"/>
+                                    <w:sz w:val="20"/>
+                                  </w:rPr>
+                                  <m:t xml:space="preserve">i</m:t>
+                                </m:r>
+                              </m:sub>
+                            </m:sSub>
+                          </m:e>
+                        </m:func>
+                      </m:e>
+                    </m:nary>
+                  </m:num>
+                  <m:den>
+                    <m:func>
+                      <m:fName>
+                        <m:r>
+                          <m:rPr>
+                            <m:nor/>
+                          </m:rPr>
+                          <w:rPr>
+                            <w:rFonts w:ascii="Cambria Math" w:hAnsi="Cambria Math"/>
+                            <w:sz w:val="20"/>
+                          </w:rPr>
+                          <m:t xml:space="preserve">ln</m:t>
+                        </m:r>
+                      </m:fName>
+                      <m:e>
+                        <m:r>
+                          <w:rPr>
+                            <w:rFonts w:ascii="Cambria Math" w:hAnsi="Cambria Math"/>
+                            <w:sz w:val="20"/>
+                          </w:rPr>
+                          <m:t xml:space="preserve">n</m:t>
+                        </m:r>
+                      </m:e>
+                    </m:func>
+                  </m:den>
+                </m:f>
+                <m:r>
+                  <w:rPr>
+                    <w:rFonts w:ascii="Cambria Math" w:hAnsi="Cambria Math"/>
+                    <w:sz w:val="20"/>
+                  </w:rPr>
+                  <m:t xml:space="preserve">.</m:t>
+                </m:r>
+              </m:oMath>
+            </m:oMathPara>
+          </w:p>
+        </w:tc>
+        <w:tc>
+          <w:tcPr>
+            <w:tcW w:type="dxa" w:w="504"/>
+            <w:vAlign w:val="center"/>
+          </w:tcPr>
+          <w:p>
+            <w:pPr>
+              <w:spacing w:before="100" w:after="100"/>
+              <w:ind w:firstLine="0"/>
+              <w:jc w:val="right"/>
+            </w:pPr>
+            <w:r>
+              <w:t>(4)</w:t>
+            </w:r>
+          </w:p>
+        </w:tc>
+      </w:tr>
+    </w:tbl>
+    <w:tbl>
+      <w:tblPr>
+        <w:tblW w:type="auto" w:w="0"/>
+        <w:jc w:val="center"/>
+        <w:tblLayout w:type="fixed"/>
+        <w:tblLook w:firstColumn="1" w:firstRow="1" w:lastColumn="0" w:lastRow="0" w:noHBand="0" w:noVBand="1" w:val="04A0"/>
+        <w:tblLayout w:type="fixed"/>
+        <w:tblCellMar>
+          <w:left w:w="0" w:type="dxa"/>
+          <w:right w:w="0" w:type="dxa"/>
+        </w:tblCellMar>
+      </w:tblPr>
+      <w:tblGrid>
+        <w:gridCol w:w="504"/>
+        <w:gridCol w:w="3996"/>
+        <w:gridCol w:w="504"/>
+      </w:tblGrid>
+      <w:tr>
+        <w:tc>
+          <w:tcPr>
+            <w:tcW w:type="dxa" w:w="504"/>
+            <w:vAlign w:val="center"/>
+          </w:tcPr>
+          <w:p>
+            <w:pPr>
+              <w:spacing w:before="100" w:after="100"/>
+              <w:ind w:firstLine="0"/>
+              <w:jc w:val="left"/>
+            </w:pPr>
+          </w:p>
+        </w:tc>
+        <w:tc>
+          <w:tcPr>
+            <w:tcW w:type="dxa" w:w="3996"/>
+            <w:vAlign w:val="center"/>
+          </w:tcPr>
+          <w:p>
+            <w:pPr>
+              <w:spacing w:before="100" w:after="100"/>
+              <w:ind w:firstLine="0"/>
+              <w:jc w:val="center"/>
+            </w:pPr>
+            <m:oMathPara>
+              <m:oMathParaPr>
+                <m:jc m:val="center"/>
+              </m:oMathParaPr>
+              <m:oMath>
+                <m:r>
+                  <w:rPr>
+                    <w:rFonts w:ascii="Cambria Math" w:hAnsi="Cambria Math"/>
+                    <w:sz w:val="20"/>
+                  </w:rPr>
+                  <m:t xml:space="preserve">G</m:t>
+                </m:r>
+                <m:r>
+                  <w:rPr>
+                    <w:rFonts w:ascii="Cambria Math" w:hAnsi="Cambria Math"/>
+                    <w:sz w:val="20"/>
+                  </w:rPr>
+                  <m:t xml:space="preserve">=</m:t>
+                </m:r>
+                <m:f>
+                  <m:num>
+                    <m:nary>
+                      <m:naryPr>
+                        <m:chr m:val="∑"/>
+                        <m:limLoc m:val="undOvr"/>
+                        <m:supHide m:val="1"/>
+                      </m:naryPr>
+                      <m:sub>
+                        <m:r>
+                          <w:rPr>
+                            <w:rFonts w:ascii="Cambria Math" w:hAnsi="Cambria Math"/>
+                            <w:sz w:val="20"/>
+                          </w:rPr>
+                          <m:t xml:space="preserve">i</m:t>
+                        </m:r>
+                      </m:sub>
+                      <m:sup/>
+                      <m:e>
+                        <m:nary>
+                          <m:naryPr>
+                            <m:chr m:val="∑"/>
+                            <m:limLoc m:val="undOvr"/>
+                            <m:supHide m:val="1"/>
+                          </m:naryPr>
+                          <m:sub>
+                            <m:r>
+                              <w:rPr>
+                                <w:rFonts w:ascii="Cambria Math" w:hAnsi="Cambria Math"/>
+                                <w:sz w:val="20"/>
+                              </w:rPr>
+                              <m:t xml:space="preserve">j</m:t>
+                            </m:r>
+                          </m:sub>
+                          <m:sup/>
+                          <m:e>
+                            <m:d>
+                              <m:dPr>
+                                <m:begChr m:val="|"/>
+                                <m:endChr m:val="|"/>
+                              </m:dPr>
+                              <m:e>
+                                <m:sSub>
+                                  <m:e>
+                                    <m:r>
+                                      <w:rPr>
+                                        <w:rFonts w:ascii="Cambria Math" w:hAnsi="Cambria Math"/>
+                                        <w:sz w:val="20"/>
+                                      </w:rPr>
+                                      <m:t xml:space="preserve">d</m:t>
+                                    </m:r>
+                                  </m:e>
+                                  <m:sub>
+                                    <m:r>
+                                      <w:rPr>
+                                        <w:rFonts w:ascii="Cambria Math" w:hAnsi="Cambria Math"/>
+                                        <w:sz w:val="20"/>
+                                      </w:rPr>
+                                      <m:t xml:space="preserve">i</m:t>
+                                    </m:r>
+                                  </m:sub>
+                                </m:sSub>
+                                <m:r>
+                                  <w:rPr>
+                                    <w:rFonts w:ascii="Cambria Math" w:hAnsi="Cambria Math"/>
+                                    <w:sz w:val="20"/>
+                                  </w:rPr>
+                                  <m:t xml:space="preserve">−</m:t>
+                                </m:r>
+                                <m:sSub>
+                                  <m:e>
+                                    <m:r>
+                                      <w:rPr>
+                                        <w:rFonts w:ascii="Cambria Math" w:hAnsi="Cambria Math"/>
+                                        <w:sz w:val="20"/>
+                                      </w:rPr>
+                                      <m:t xml:space="preserve">d</m:t>
+                                    </m:r>
+                                  </m:e>
+                                  <m:sub>
+                                    <m:r>
+                                      <w:rPr>
+                                        <w:rFonts w:ascii="Cambria Math" w:hAnsi="Cambria Math"/>
+                                        <w:sz w:val="20"/>
+                                      </w:rPr>
+                                      <m:t xml:space="preserve">j</m:t>
+                                    </m:r>
+                                  </m:sub>
+                                </m:sSub>
+                              </m:e>
+                            </m:d>
+                          </m:e>
+                        </m:nary>
+                      </m:e>
+                    </m:nary>
+                  </m:num>
+                  <m:den>
+                    <m:r>
+                      <w:rPr>
+                        <w:rFonts w:ascii="Cambria Math" w:hAnsi="Cambria Math"/>
+                        <w:sz w:val="20"/>
+                      </w:rPr>
+                      <m:t xml:space="preserve">2</m:t>
+                    </m:r>
+                    <m:r>
+                      <w:rPr>
+                        <w:rFonts w:ascii="Cambria Math" w:hAnsi="Cambria Math"/>
+                        <w:sz w:val="20"/>
+                      </w:rPr>
+                      <m:t xml:space="preserve">n</m:t>
+                    </m:r>
+                    <m:nary>
+                      <m:naryPr>
+                        <m:chr m:val="∑"/>
+                        <m:limLoc m:val="undOvr"/>
+                        <m:supHide m:val="1"/>
+                      </m:naryPr>
+                      <m:sub>
+                        <m:r>
+                          <w:rPr>
+                            <w:rFonts w:ascii="Cambria Math" w:hAnsi="Cambria Math"/>
+                            <w:sz w:val="20"/>
+                          </w:rPr>
+                          <m:t xml:space="preserve">i</m:t>
+                        </m:r>
+                      </m:sub>
+                      <m:sup/>
+                      <m:e>
+                        <m:sSub>
+                          <m:e>
+                            <m:r>
+                              <w:rPr>
+                                <w:rFonts w:ascii="Cambria Math" w:hAnsi="Cambria Math"/>
+                                <w:sz w:val="20"/>
+                              </w:rPr>
+                              <m:t xml:space="preserve">d</m:t>
+                            </m:r>
+                          </m:e>
+                          <m:sub>
+                            <m:r>
+                              <w:rPr>
+                                <w:rFonts w:ascii="Cambria Math" w:hAnsi="Cambria Math"/>
+                                <w:sz w:val="20"/>
+                              </w:rPr>
+                              <m:t xml:space="preserve">i</m:t>
+                            </m:r>
+                          </m:sub>
+                        </m:sSub>
+                      </m:e>
+                    </m:nary>
+                  </m:den>
+                </m:f>
+                <m:r>
+                  <w:rPr>
+                    <w:rFonts w:ascii="Cambria Math" w:hAnsi="Cambria Math"/>
+                    <w:sz w:val="20"/>
+                  </w:rPr>
+                  <m:t xml:space="preserve">.</m:t>
+                </m:r>
+              </m:oMath>
+            </m:oMathPara>
+          </w:p>
+        </w:tc>
+        <w:tc>
+          <w:tcPr>
+            <w:tcW w:type="dxa" w:w="504"/>
+            <w:vAlign w:val="center"/>
+          </w:tcPr>
+          <w:p>
+            <w:pPr>
+              <w:spacing w:before="100" w:after="100"/>
+              <w:ind w:firstLine="0"/>
+              <w:jc w:val="right"/>
+            </w:pPr>
+            <w:r>
+              <w:t>(5)</w:t>
+            </w:r>
+          </w:p>
+        </w:tc>
+      </w:tr>
+    </w:tbl>
     <w:p>
       <w:pPr>
         <w:spacing w:before="0" w:after="0"/>
         <w:jc w:val="both"/>
       </w:pPr>
       <w:r>
-        <w:t>The current implementation computes these group-level quantities over participants with at least one detected turn. Silent participants are omitted from that denominator. Thus, low Gini or high entropy indicates balance among detected speakers, not necessarily inclusion of all attendees. The implementation assigns entropy zero when there is only one active participant; for positive speaking duration, the uncorrected Gini coefficient has a finite-group maximum of (n - 1)/n.</w:t>
+        <w:t xml:space="preserve">The current implementation computes these group-level quantities over participants with at least one detected turn. Silent participants are omitted from that denominator. Thus, low Gini or high entropy indicates balance among detected speakers, not necessarily inclusion of all attendees. The implementation assigns entropy zero when there is only one active participant; for positive speaking duration, the uncorrected Gini coefficient has a finite-group maximum of </w:t>
+      </w:r>
+      <m:oMath>
+        <m:r>
+          <w:rPr>
+            <w:rFonts w:ascii="Cambria Math" w:hAnsi="Cambria Math"/>
+            <w:sz w:val="20"/>
+          </w:rPr>
+          <m:t xml:space="preserve">(</m:t>
+        </m:r>
+        <m:r>
+          <w:rPr>
+            <w:rFonts w:ascii="Cambria Math" w:hAnsi="Cambria Math"/>
+            <w:sz w:val="20"/>
+          </w:rPr>
+          <m:t xml:space="preserve">n</m:t>
+        </m:r>
+        <m:r>
+          <w:rPr>
+            <w:rFonts w:ascii="Cambria Math" w:hAnsi="Cambria Math"/>
+            <w:sz w:val="20"/>
+          </w:rPr>
+          <m:t xml:space="preserve">−</m:t>
+        </m:r>
+        <m:r>
+          <w:rPr>
+            <w:rFonts w:ascii="Cambria Math" w:hAnsi="Cambria Math"/>
+            <w:sz w:val="20"/>
+          </w:rPr>
+          <m:t xml:space="preserve">1</m:t>
+        </m:r>
+        <m:r>
+          <w:rPr>
+            <w:rFonts w:ascii="Cambria Math" w:hAnsi="Cambria Math"/>
+            <w:sz w:val="20"/>
+          </w:rPr>
+          <m:t xml:space="preserve">)</m:t>
+        </m:r>
+        <m:r>
+          <w:rPr>
+            <w:rFonts w:ascii="Cambria Math" w:hAnsi="Cambria Math"/>
+            <w:sz w:val="20"/>
+          </w:rPr>
+          <m:t xml:space="preserve">/</m:t>
+        </m:r>
+        <m:r>
+          <w:rPr>
+            <w:rFonts w:ascii="Cambria Math" w:hAnsi="Cambria Math"/>
+            <w:sz w:val="20"/>
+          </w:rPr>
+          <m:t xml:space="preserve">n</m:t>
+        </m:r>
+      </m:oMath>
+      <w:r>
+        <w:t>.</w:t>
       </w:r>
     </w:p>
     <w:p>

</xml_diff>

<commit_message>
feat(paper): pool 10x10 repeated CV in confusion matrices
Repeat stratified 10-fold evaluation with seeds 1-10 and show the pooled
160-prediction meeting-effectiveness matrices in Figure 2. Add repeated
rows to Table 1, update text in all manuscript formats, and fall back to
Inkscape for figure exports when rsvg-convert is unavailable.
</commit_message>
<xml_diff>
--- a/paper/manuscript.docx
+++ b/paper/manuscript.docx
@@ -60,7 +60,7 @@
         <w:t xml:space="preserve">Abstract: </w:t>
       </w:r>
       <w:r>
-        <w:t>Wearable sensing can describe conversational participation without retaining intelligible speech. This paper presents a Bluetooth Low Energy smart badge pipeline that converts sound-level and motion measurements into estimated speaker activity and 36 session-level predictors. Sixteen records comprise private meetings and two small classroom lectures. Low, medium, and high effectiveness labels were assigned from the automatic-label outputs; the target is therefore an author-assigned, sensor-informed judgment, not an independent outcome measure. Recovered files reproduce all 48 feature tables and 576 exported predictor values. Using logged WEKA model settings and an explicit 10-fold seed-1 reconstruction, Random Forest correctly classifies 15/16 records (93.75%) and a multilayer perceptron 13/16 (81.25%), matching the reported confusion matrices and probability-error summaries. Paired majority and regularized-logistic baselines classify 7/16 and 11/16 records, respectively. A speaker-label audit finds that only 16.87% of unique badge-timestamp keys were annotated, all as active. Automatic activity recovers 30.83% of these annotated active keys; precision, specificity, and overall accuracy cannot be established because unknown time was never annotated. The results demonstrate numerical reproducibility and classification of the available judgments, while feature-informed labels, recurring participants, limited class coverage, and incomplete speech annotations preclude independent effectiveness or speaker-accuracy claims.</w:t>
+        <w:t>Wearable sensing can describe conversational participation without retaining intelligible speech. This paper presents a Bluetooth Low Energy smart badge pipeline that converts sound-level and motion measurements into estimated speaker activity and 36 session-level predictors. Sixteen records comprise private meetings and two small classroom lectures. Low, medium, and high effectiveness labels were assigned from the automatic-label outputs; the target is therefore an author-assigned, sensor-informed judgment, not an independent outcome measure. Recovered files reproduce all 48 feature tables and 576 exported predictor values. Using logged WEKA model settings and an explicit 10-fold seed-1 reconstruction, Random Forest correctly classifies 15/16 records (93.75%) and a multilayer perceptron 13/16 (81.25%), matching the reported confusion matrices and probability-error summaries. Repeating the 10-fold evaluation with ten evaluation seeds yields pooled accuracies of 91.88% (147/160 predictions) and 81.25% (130/160). Paired majority and regularized-logistic baselines classify 7/16 and 11/16 records, respectively. A speaker-label audit finds that only 16.87% of unique badge-timestamp keys were annotated, all as active. Automatic activity recovers 30.83% of these annotated active keys; precision, specificity, and overall accuracy cannot be established because unknown time was never annotated. The results demonstrate numerical reproducibility and classification of the available judgments, while feature-informed labels, recurring participants, limited class coverage, and incomplete speech annotations preclude independent effectiveness or speaker-accuracy claims.</w:t>
       </w:r>
     </w:p>
     <w:p>
@@ -3054,7 +3054,7 @@
         <w:jc w:val="both"/>
       </w:pPr>
       <w:r>
-        <w:t>Random Forest uses 100 trees, 100% bag size, automatic feature-subset size, minimum leaf weight 1, variance threshold 0.001, one execution slot, and model seed 1. The multilayer perceptron uses learning rate 0.3, momentum 0.2, 500 epochs, no validation holdout, validation threshold 20, an automatically sized hidden layer, and model seed 0. These are the recorded option values. Evaluation randomization uses seed 1, separately from each model's seed. Table 1 gives the reported results now matched by the numerical reconstruction; new baselines and sensitivity checks are distinguished below.</w:t>
+        <w:t>Random Forest uses 100 trees, 100% bag size, automatic feature-subset size, minimum leaf weight 1, variance threshold 0.001, one execution slot, and model seed 1. The multilayer perceptron uses learning rate 0.3, momentum 0.2, 500 epochs, no validation holdout, validation threshold 20, an automatically sized hidden layer, and model seed 0. These are the recorded option values. Evaluation randomization uses seed 1, separately from each model's seed. To reduce dependence on a single fold assignment, the stratified 10-fold evaluation is also repeated with evaluation seeds 1 through 10, holding model seeds fixed. Each repeat tests every record once, so pooled repeated results contain 160 predictions of the same 16 records, not 160 independent meetings. Table 1 gives the reported results now matched by the numerical reconstruction, together with the repeated evaluation; new baselines and sensitivity checks are distinguished below.</w:t>
       </w:r>
     </w:p>
     <w:p>
@@ -3100,7 +3100,7 @@
         <w:rPr>
           <w:sz w:val="16"/>
         </w:rPr>
-        <w:t>Meeting-effectiveness classification with 10-fold cross-validation.</w:t>
+        <w:t>Meeting-effectiveness classification with 10-fold cross-validation. Repeated rows pool ten evaluation seeds; SD is across seeds.</w:t>
       </w:r>
     </w:p>
     <w:tbl>
@@ -3547,6 +3547,218 @@
           </w:p>
         </w:tc>
       </w:tr>
+      <w:tr>
+        <w:tc>
+          <w:tcPr>
+            <w:tcW w:type="dxa" w:w="2502"/>
+          </w:tcPr>
+          <w:p>
+            <w:pPr>
+              <w:ind w:firstLine="0"/>
+              <w:jc w:val="left"/>
+            </w:pPr>
+            <w:r>
+              <w:rPr>
+                <w:sz w:val="16"/>
+              </w:rPr>
+              <w:t>Correct predictions, 10x10 repeated</w:t>
+            </w:r>
+          </w:p>
+        </w:tc>
+        <w:tc>
+          <w:tcPr>
+            <w:tcW w:type="dxa" w:w="1251"/>
+          </w:tcPr>
+          <w:p>
+            <w:pPr>
+              <w:ind w:firstLine="0"/>
+              <w:jc w:val="left"/>
+            </w:pPr>
+            <w:r>
+              <w:rPr>
+                <w:sz w:val="16"/>
+              </w:rPr>
+              <w:t>147/160</w:t>
+            </w:r>
+          </w:p>
+        </w:tc>
+        <w:tc>
+          <w:tcPr>
+            <w:tcW w:type="dxa" w:w="1251"/>
+          </w:tcPr>
+          <w:p>
+            <w:pPr>
+              <w:ind w:firstLine="0"/>
+              <w:jc w:val="left"/>
+            </w:pPr>
+            <w:r>
+              <w:rPr>
+                <w:sz w:val="16"/>
+              </w:rPr>
+              <w:t>130/160</w:t>
+            </w:r>
+          </w:p>
+        </w:tc>
+      </w:tr>
+      <w:tr>
+        <w:tc>
+          <w:tcPr>
+            <w:tcW w:type="dxa" w:w="2502"/>
+          </w:tcPr>
+          <w:p>
+            <w:pPr>
+              <w:ind w:firstLine="0"/>
+              <w:jc w:val="left"/>
+            </w:pPr>
+            <w:r>
+              <w:rPr>
+                <w:sz w:val="16"/>
+              </w:rPr>
+              <w:t>Accuracy, 10x10 repeated (SD)</w:t>
+            </w:r>
+          </w:p>
+        </w:tc>
+        <w:tc>
+          <w:tcPr>
+            <w:tcW w:type="dxa" w:w="1251"/>
+          </w:tcPr>
+          <w:p>
+            <w:pPr>
+              <w:ind w:firstLine="0"/>
+              <w:jc w:val="left"/>
+            </w:pPr>
+            <w:r>
+              <w:rPr>
+                <w:sz w:val="16"/>
+              </w:rPr>
+              <w:t>91.88% (4.22)</w:t>
+            </w:r>
+          </w:p>
+        </w:tc>
+        <w:tc>
+          <w:tcPr>
+            <w:tcW w:type="dxa" w:w="1251"/>
+          </w:tcPr>
+          <w:p>
+            <w:pPr>
+              <w:ind w:firstLine="0"/>
+              <w:jc w:val="left"/>
+            </w:pPr>
+            <w:r>
+              <w:rPr>
+                <w:sz w:val="16"/>
+              </w:rPr>
+              <w:t>81.25% (0.00)</w:t>
+            </w:r>
+          </w:p>
+        </w:tc>
+      </w:tr>
+      <w:tr>
+        <w:tc>
+          <w:tcPr>
+            <w:tcW w:type="dxa" w:w="2502"/>
+          </w:tcPr>
+          <w:p>
+            <w:pPr>
+              <w:ind w:firstLine="0"/>
+              <w:jc w:val="left"/>
+            </w:pPr>
+            <w:r>
+              <w:rPr>
+                <w:sz w:val="16"/>
+              </w:rPr>
+              <w:t>Cohen's kappa, 10x10 repeated</w:t>
+            </w:r>
+          </w:p>
+        </w:tc>
+        <w:tc>
+          <w:tcPr>
+            <w:tcW w:type="dxa" w:w="1251"/>
+          </w:tcPr>
+          <w:p>
+            <w:pPr>
+              <w:ind w:firstLine="0"/>
+              <w:jc w:val="left"/>
+            </w:pPr>
+            <w:r>
+              <w:rPr>
+                <w:sz w:val="16"/>
+              </w:rPr>
+              <w:t>0.8739</w:t>
+            </w:r>
+          </w:p>
+        </w:tc>
+        <w:tc>
+          <w:tcPr>
+            <w:tcW w:type="dxa" w:w="1251"/>
+          </w:tcPr>
+          <w:p>
+            <w:pPr>
+              <w:ind w:firstLine="0"/>
+              <w:jc w:val="left"/>
+            </w:pPr>
+            <w:r>
+              <w:rPr>
+                <w:sz w:val="16"/>
+              </w:rPr>
+              <w:t>0.7091</w:t>
+            </w:r>
+          </w:p>
+        </w:tc>
+      </w:tr>
+      <w:tr>
+        <w:tc>
+          <w:tcPr>
+            <w:tcW w:type="dxa" w:w="2502"/>
+          </w:tcPr>
+          <w:p>
+            <w:pPr>
+              <w:ind w:firstLine="0"/>
+              <w:jc w:val="left"/>
+            </w:pPr>
+            <w:r>
+              <w:rPr>
+                <w:sz w:val="16"/>
+              </w:rPr>
+              <w:t>Macro-F1, 10x10 repeated</w:t>
+            </w:r>
+          </w:p>
+        </w:tc>
+        <w:tc>
+          <w:tcPr>
+            <w:tcW w:type="dxa" w:w="1251"/>
+          </w:tcPr>
+          <w:p>
+            <w:pPr>
+              <w:ind w:firstLine="0"/>
+              <w:jc w:val="left"/>
+            </w:pPr>
+            <w:r>
+              <w:rPr>
+                <w:sz w:val="16"/>
+              </w:rPr>
+              <w:t>0.9245</w:t>
+            </w:r>
+          </w:p>
+        </w:tc>
+        <w:tc>
+          <w:tcPr>
+            <w:tcW w:type="dxa" w:w="1251"/>
+          </w:tcPr>
+          <w:p>
+            <w:pPr>
+              <w:ind w:firstLine="0"/>
+              <w:jc w:val="left"/>
+            </w:pPr>
+            <w:r>
+              <w:rPr>
+                <w:sz w:val="16"/>
+              </w:rPr>
+              <w:t>0.8130</w:t>
+            </w:r>
+          </w:p>
+        </w:tc>
+      </w:tr>
     </w:tbl>
     <w:p>
       <w:pPr>
@@ -3569,7 +3781,16 @@
         <w:jc w:val="both"/>
       </w:pPr>
       <w:r>
-        <w:t>Figure 2 presents the confusion matrices. Random Forest recalls are 0.800, 1.000, and 1.000 for low, medium, and high effectiveness, respectively. Corresponding multilayer-perceptron recalls are 0.600, 0.857, and 1.000. The sole Random Forest error is a low-effectiveness meeting classified as medium. This error reduces medium-class precision to 0.875 while medium-class recall remains 1.000.</w:t>
+        <w:t>In the seed-1 reconstruction, Random Forest recalls are 0.800, 1.000, and 1.000 for low, medium, and high effectiveness, respectively. Corresponding multilayer-perceptron recalls are 0.600, 0.857, and 1.000. The sole Random Forest error is a low-effectiveness meeting classified as medium. This error reduces medium-class precision to 0.875 while medium-class recall remains 1.000.</w:t>
+      </w:r>
+    </w:p>
+    <w:p>
+      <w:pPr>
+        <w:spacing w:before="0" w:after="0"/>
+        <w:jc w:val="both"/>
+      </w:pPr>
+      <w:r>
+        <w:t>Figure 2 presents the confusion matrices pooled over the ten repeated evaluations. Random Forest accuracy varies from 87.50% to 100% across seeds. Its pooled recalls are 0.820, 0.943, and 1.000, and its errors are confined to the low/medium boundary: nine low predictions assigned medium and four medium predictions assigned low. The multilayer perceptron produces the same predictions under every seed, so its pooled matrix is ten times the seed-1 matrix. No model assigns a low meeting to high or a high meeting to low in any repeat. Repetition reduces dependence on one fold assignment; it does not increase the number of independent records.</w:t>
       </w:r>
     </w:p>
     <w:p>
@@ -3630,7 +3851,7 @@
         <w:rPr>
           <w:sz w:val="16"/>
         </w:rPr>
-        <w:t>Meeting-effectiveness confusion matrices for Random Forest and the multilayer perceptron. Rows are actual labels and columns are predicted labels. Each panel summarizes reported predictions for 16 session records.</w:t>
+        <w:t>Meeting-effectiveness confusion matrices for Random Forest and the multilayer perceptron. Rows are actual labels and columns are predicted labels. Each panel pools stratified 10-fold predictions over ten evaluation seeds: 160 predictions of 16 session records.</w:t>
       </w:r>
     </w:p>
     <w:p>
@@ -4553,7 +4774,7 @@
         <w:jc w:val="both"/>
       </w:pPr>
       <w:r>
-        <w:t>In the reconstructed 10-fold evaluation, Logistic has macro-F1 0.6758 and balanced accuracy 0.6524. Leaving one of the three recorded contexts out gives 4/16 correct for ZeroR, 10/16 for Logistic, 16/16 for Random Forest, and 13/16 for the multilayer perceptron. These are new exploratory checks, not additional independent datasets. In particular, the perfect Random Forest context-held-out score does not resolve feature-informed labeling or participant overlap. No significance or generalization claim is made from these small, dependent comparisons.</w:t>
+        <w:t>In the reconstructed 10-fold evaluation, Logistic has macro-F1 0.6758 and balanced accuracy 0.6524. Leaving one of the three recorded contexts out gives 4/16 correct for ZeroR, 10/16 for Logistic, 16/16 for Random Forest, and 13/16 for the multilayer perceptron. Over the ten repeated 10-fold evaluations, ZeroR obtains 70/160 and Logistic 113/160 correct predictions (70.63%, SD 3.02 across seeds). These are new exploratory checks, not additional independent datasets. In particular, the perfect Random Forest context-held-out score does not resolve feature-informed labeling or participant overlap. No significance or generalization claim is made from these small, dependent comparisons.</w:t>
       </w:r>
     </w:p>
     <w:p>
@@ -4604,7 +4825,7 @@
         <w:jc w:val="both"/>
       </w:pPr>
       <w:r>
-        <w:t>The dataset has 16 session records and 36 exported predictors, two of which are constant zero. Each changed prediction alters accuracy by 6.25 percentage points, making performance estimates sensitive to individual meetings. Ten-fold validation necessarily uses very small test folds, and the class counts do not permit every fold to contain all three classes. Neither the reported accuracy nor kappa resolves uncertainty from limited data or repeated participants.</w:t>
+        <w:t>The dataset has 16 session records and 36 exported predictors, two of which are constant zero. Each changed prediction alters accuracy by 6.25 percentage points, making performance estimates sensitive to individual meetings. Ten-fold validation necessarily uses very small test folds, and the class counts do not permit every fold to contain all three classes. Neither the reported accuracy nor kappa resolves uncertainty from limited data or repeated participants. Repeated cross-validation shows that the Random Forest score depends on fold assignment by up to two records, but its pooled 160 predictions remain repeated tests of the same 16 records.</w:t>
       </w:r>
     </w:p>
     <w:p>

</xml_diff>